<commit_message>
Add cover page and submitter details across all documents
Cover page on the mapping document with the Kibbutzim College logo,
institution name, course lecturer, submitter name and ID, and date.
The teacher/submitter name is now Hanadi Salem in all four documents,
and both lesson plans carry a submitter line under the topic.

Co-Authored-By: Claude Fable 5 <noreply@anthropic.com>
Claude-Session: https://claude.ai/code/session_01EMxFUHHVvpa8bYzfYkV3bj
</commit_message>
<xml_diff>
--- a/lesson-plan/אבחון-המספרים-השלמים-מלא.docx
+++ b/lesson-plan/אבחון-המספרים-השלמים-מלא.docx
@@ -104,7 +104,7 @@
                                 <w:szCs w:val="24"/>
                                 <w:rtl/>
                               </w:rPr>
-                              <w:t xml:space="preserve">שם המורה:  רוואן                                 שם התלמיד:יובל (שם בדוי)</w:t>
+                              <w:t xml:space="preserve">שם המורה:  הנאדי סאלם                                 שם התלמיד:יובל (שם בדוי)</w:t>
                             </w:r>
                           </w:p>
                           <w:p>
@@ -337,7 +337,7 @@
                           <w:szCs w:val="24"/>
                           <w:rtl/>
                         </w:rPr>
-                        <w:t xml:space="preserve">שם המורה:  רוואן                                 שם התלמיד:יובל (שם בדוי)</w:t>
+                        <w:t xml:space="preserve">שם המורה:  הנאדי סאלם                                 שם התלמיד:יובל (שם בדוי)</w:t>
                       </w:r>
                     </w:p>
                     <w:p>

</xml_diff>